<commit_message>
Added runit examples for tprime and catgt and completed scripts for checking ttls andn creating summary csv, as well as advanced pipeline word document
</commit_message>
<xml_diff>
--- a/Neuropixels Data Processing Pipeline.docx
+++ b/Neuropixels Data Processing Pipeline.docx
@@ -194,6 +194,29 @@
       <w:r>
         <w:t xml:space="preserve"> to be done.</w:t>
       </w:r>
+      <w:r>
+        <w:t xml:space="preserve"> </w:t>
+      </w:r>
+      <w:r>
+        <w:t xml:space="preserve">Use </w:t>
+      </w:r>
+      <w:proofErr w:type="spellStart"/>
+      <w:r>
+        <w:rPr>
+          <w:i/>
+        </w:rPr>
+        <w:t>CatGt</w:t>
+      </w:r>
+      <w:r>
+        <w:rPr>
+          <w:i/>
+        </w:rPr>
+        <w:t>_runit_example</w:t>
+      </w:r>
+      <w:proofErr w:type="spellEnd"/>
+      <w:r>
+        <w:t xml:space="preserve"> file contents as a guide to fill in new information.</w:t>
+      </w:r>
     </w:p>
     <w:p>
       <w:pPr>
@@ -611,8 +634,6 @@
       <w:r>
         <w:t xml:space="preserve">  </w:t>
       </w:r>
-      <w:bookmarkStart w:id="0" w:name="_GoBack"/>
-      <w:bookmarkEnd w:id="0"/>
     </w:p>
     <w:p>
       <w:pPr>
@@ -689,13 +710,19 @@
       </w:r>
       <w:proofErr w:type="spellEnd"/>
       <w:r>
-        <w:t xml:space="preserve"> script to generate a mat file specifying channel map for the current recording. </w:t>
+        <w:t xml:space="preserve"> script to generate a mat file specifying </w:t>
+      </w:r>
+      <w:r>
+        <w:t xml:space="preserve">the </w:t>
+      </w:r>
+      <w:r>
+        <w:t xml:space="preserve">channel map for the current recording. </w:t>
       </w:r>
       <w:r>
         <w:t xml:space="preserve">Select output type 1. </w:t>
       </w:r>
       <w:r>
-        <w:t xml:space="preserve">Output is a mat file with </w:t>
+        <w:t>Output is a mat file with</w:t>
       </w:r>
     </w:p>
     <w:p>
@@ -773,6 +800,48 @@
         <w:jc w:val="both"/>
       </w:pPr>
       <w:r>
+        <w:t>If GUI is not opening run “</w:t>
+      </w:r>
+      <w:r>
+        <w:t xml:space="preserve">python -m </w:t>
+      </w:r>
+      <w:proofErr w:type="spellStart"/>
+      <w:r>
+        <w:t>kilosort</w:t>
+      </w:r>
+      <w:proofErr w:type="spellEnd"/>
+      <w:r>
+        <w:t xml:space="preserve"> </w:t>
+      </w:r>
+      <w:r>
+        <w:t>--reset</w:t>
+      </w:r>
+      <w:r>
+        <w:t xml:space="preserve">”. Kilosort always tries to retrieve previous dataset, sometimes cannot find </w:t>
+      </w:r>
+      <w:r>
+        <w:t xml:space="preserve">it </w:t>
+      </w:r>
+      <w:r>
+        <w:t xml:space="preserve">and </w:t>
+      </w:r>
+      <w:proofErr w:type="spellStart"/>
+      <w:r>
+        <w:t>wont</w:t>
+      </w:r>
+      <w:proofErr w:type="spellEnd"/>
+      <w:r>
+        <w:t xml:space="preserve"> open. </w:t>
+      </w:r>
+    </w:p>
+    <w:p>
+      <w:pPr>
+        <w:tabs>
+          <w:tab w:val="left" w:pos="2581"/>
+        </w:tabs>
+        <w:jc w:val="both"/>
+      </w:pPr>
+      <w:r>
         <w:t xml:space="preserve">In GUI select ap file to sort. Usually </w:t>
       </w:r>
       <w:proofErr w:type="spellStart"/>
@@ -792,16 +861,21 @@
         <w:jc w:val="both"/>
       </w:pPr>
       <w:r>
+        <w:rPr>
+          <w:b/>
+        </w:rPr>
+        <w:lastRenderedPageBreak/>
+        <w:t>Probe Layout:</w:t>
+      </w:r>
+      <w:r>
+        <w:t xml:space="preserve"> </w:t>
+      </w:r>
+      <w:r>
         <w:t>For Neuropixels 1, just pick corresponding map from list.</w:t>
       </w:r>
-    </w:p>
-    <w:p>
-      <w:pPr>
-        <w:tabs>
-          <w:tab w:val="left" w:pos="2581"/>
-        </w:tabs>
-        <w:jc w:val="both"/>
-      </w:pPr>
+      <w:r>
+        <w:t xml:space="preserve"> </w:t>
+      </w:r>
       <w:r>
         <w:t xml:space="preserve">For Npx2 specify the channel map with the mat file previously generated. </w:t>
       </w:r>
@@ -812,12 +886,50 @@
           <w:tab w:val="left" w:pos="2581"/>
         </w:tabs>
         <w:jc w:val="both"/>
-        <w:rPr>
+      </w:pPr>
+      <w:r>
+        <w:rPr>
+          <w:b/>
+        </w:rPr>
+        <w:t xml:space="preserve">Sampling frequency: </w:t>
+      </w:r>
+      <w:r>
+        <w:t xml:space="preserve">If </w:t>
+      </w:r>
+      <w:proofErr w:type="spellStart"/>
+      <w:r>
+        <w:t>headtage</w:t>
+      </w:r>
+      <w:proofErr w:type="spellEnd"/>
+      <w:r>
+        <w:t xml:space="preserve"> was calibrated, change sampling rate to that one (in meta file). In Kilosort 4 there is no need to have </w:t>
+      </w:r>
+      <w:proofErr w:type="spellStart"/>
+      <w:r>
+        <w:t>npy-matlab</w:t>
+      </w:r>
+      <w:proofErr w:type="spellEnd"/>
+      <w:r>
+        <w:t xml:space="preserve"> library in Kilosort folder, it comes with the installation (python based).</w:t>
+      </w:r>
+      <w:r>
+        <w:t xml:space="preserve"> </w:t>
+      </w:r>
+    </w:p>
+    <w:p>
+      <w:pPr>
+        <w:tabs>
+          <w:tab w:val="left" w:pos="2581"/>
+        </w:tabs>
+        <w:jc w:val="both"/>
+        <w:rPr>
+          <w:b/>
           <w:i/>
         </w:rPr>
       </w:pPr>
       <w:r>
         <w:rPr>
+          <w:b/>
           <w:i/>
         </w:rPr>
         <w:t>Default parameters are:</w:t>
@@ -831,7 +943,6 @@
         <w:jc w:val="both"/>
       </w:pPr>
       <w:r>
-        <w:lastRenderedPageBreak/>
         <w:t xml:space="preserve">Data </w:t>
       </w:r>
       <w:proofErr w:type="spellStart"/>
@@ -840,18 +951,25 @@
       </w:r>
       <w:proofErr w:type="spellEnd"/>
       <w:r>
-        <w:t>: int16                              Number of channels: 385</w:t>
-      </w:r>
-    </w:p>
-    <w:p>
-      <w:pPr>
-        <w:tabs>
-          <w:tab w:val="left" w:pos="2581"/>
-        </w:tabs>
-        <w:jc w:val="both"/>
-      </w:pPr>
-      <w:r>
-        <w:t xml:space="preserve">Sampling frequency: 30000            Batch size: 60000                    </w:t>
+        <w:t>: int16</w:t>
+      </w:r>
+      <w:r>
+        <w:t xml:space="preserve">, </w:t>
+      </w:r>
+      <w:r>
+        <w:t>Number of channels: 385</w:t>
+      </w:r>
+      <w:r>
+        <w:t xml:space="preserve">, </w:t>
+      </w:r>
+      <w:r>
+        <w:t>Sampling frequency: 30000</w:t>
+      </w:r>
+      <w:r>
+        <w:t>, B</w:t>
+      </w:r>
+      <w:r>
+        <w:t xml:space="preserve">atch size: 60000                    </w:t>
       </w:r>
       <w:proofErr w:type="spellStart"/>
       <w:r>
@@ -861,36 +979,38 @@
       <w:r>
         <w:t>: 1</w:t>
       </w:r>
-    </w:p>
-    <w:p>
-      <w:pPr>
-        <w:tabs>
-          <w:tab w:val="left" w:pos="2581"/>
-        </w:tabs>
-        <w:jc w:val="both"/>
-      </w:pPr>
-      <w:r>
-        <w:t>Th (universal): 9                                Th (learned): 8</w:t>
-      </w:r>
-    </w:p>
-    <w:p>
-      <w:pPr>
-        <w:tabs>
-          <w:tab w:val="left" w:pos="2581"/>
-        </w:tabs>
-        <w:jc w:val="both"/>
-      </w:pPr>
+      <w:r>
+        <w:t xml:space="preserve">, </w:t>
+      </w:r>
+      <w:r>
+        <w:t>Th (universal): 9</w:t>
+      </w:r>
+      <w:r>
+        <w:t>,</w:t>
+      </w:r>
+      <w:r>
+        <w:t xml:space="preserve"> Th (learned): 8</w:t>
+      </w:r>
+      <w:r>
+        <w:t xml:space="preserve">, </w:t>
+      </w:r>
       <w:proofErr w:type="spellStart"/>
       <w:r>
         <w:t>Tmin</w:t>
       </w:r>
       <w:proofErr w:type="spellEnd"/>
       <w:r>
-        <w:t xml:space="preserve">: 0                                                </w:t>
-      </w:r>
-      <w:proofErr w:type="spellStart"/>
-      <w:r>
-        <w:t>tmax</w:t>
+        <w:t>: 0</w:t>
+      </w:r>
+      <w:r>
+        <w:t xml:space="preserve">, </w:t>
+      </w:r>
+      <w:proofErr w:type="spellStart"/>
+      <w:r>
+        <w:t>T</w:t>
+      </w:r>
+      <w:r>
+        <w:t>max</w:t>
       </w:r>
       <w:proofErr w:type="spellEnd"/>
       <w:r>
@@ -899,57 +1019,16 @@
     </w:p>
     <w:p>
       <w:pPr>
-        <w:tabs>
-          <w:tab w:val="left" w:pos="2581"/>
-        </w:tabs>
-        <w:jc w:val="both"/>
-        <w:rPr>
-          <w:i/>
-        </w:rPr>
-      </w:pPr>
-      <w:r>
-        <w:rPr>
-          <w:i/>
-        </w:rPr>
-        <w:t>Notes:</w:t>
-      </w:r>
-    </w:p>
-    <w:p>
-      <w:pPr>
-        <w:tabs>
-          <w:tab w:val="left" w:pos="2581"/>
-        </w:tabs>
-        <w:jc w:val="both"/>
-      </w:pPr>
-      <w:r>
-        <w:t xml:space="preserve">If </w:t>
-      </w:r>
-      <w:proofErr w:type="spellStart"/>
-      <w:r>
-        <w:t>headtage</w:t>
-      </w:r>
-      <w:proofErr w:type="spellEnd"/>
-      <w:r>
-        <w:t xml:space="preserve"> was calibrated, change sampling rate to that one (in meta file)</w:t>
-      </w:r>
-      <w:r>
-        <w:t xml:space="preserve">. In Kilosort 4 there is no need to have </w:t>
-      </w:r>
-      <w:proofErr w:type="spellStart"/>
-      <w:r>
-        <w:t>npy-matlab</w:t>
-      </w:r>
-      <w:proofErr w:type="spellEnd"/>
-      <w:r>
-        <w:t xml:space="preserve"> library in Kilosort folder, it comes with the installation (python based).</w:t>
-      </w:r>
-    </w:p>
-    <w:p>
-      <w:pPr>
-        <w:jc w:val="both"/>
-      </w:pPr>
-      <w:r>
-        <w:t xml:space="preserve">Kilosort 4 parameters: </w:t>
+        <w:jc w:val="both"/>
+      </w:pPr>
+      <w:r>
+        <w:rPr>
+          <w:b/>
+        </w:rPr>
+        <w:t>Kilosort 4 parameters:</w:t>
+      </w:r>
+      <w:r>
+        <w:t xml:space="preserve"> </w:t>
       </w:r>
       <w:hyperlink r:id="rId5" w:history="1">
         <w:r>
@@ -985,88 +1064,33 @@
         <w:rPr>
           <w:b/>
         </w:rPr>
-        <w:t xml:space="preserve">Convert </w:t>
-      </w:r>
-      <w:proofErr w:type="spellStart"/>
-      <w:r>
-        <w:rPr>
-          <w:b/>
-        </w:rPr>
-        <w:t>spike_times.npy</w:t>
-      </w:r>
-      <w:proofErr w:type="spellEnd"/>
-      <w:r>
-        <w:rPr>
-          <w:b/>
-        </w:rPr>
-        <w:t xml:space="preserve"> to </w:t>
-      </w:r>
-      <w:proofErr w:type="spellStart"/>
-      <w:r>
-        <w:rPr>
-          <w:b/>
-        </w:rPr>
-        <w:t>spike_seconds.npy</w:t>
-      </w:r>
-      <w:proofErr w:type="spellEnd"/>
-    </w:p>
-    <w:p>
-      <w:pPr>
-        <w:tabs>
-          <w:tab w:val="left" w:pos="2581"/>
-        </w:tabs>
-        <w:jc w:val="both"/>
-      </w:pPr>
-      <w:r>
-        <w:t xml:space="preserve">Output of </w:t>
-      </w:r>
-      <w:proofErr w:type="spellStart"/>
-      <w:r>
-        <w:t>kilosort</w:t>
-      </w:r>
-      <w:proofErr w:type="spellEnd"/>
-      <w:r>
-        <w:t xml:space="preserve"> takes time as samples, so it needs to be converted to seconds. Just divide spike times over the sampling rate.  Run MATLAB script </w:t>
-      </w:r>
-      <w:r>
-        <w:rPr>
-          <w:b/>
-        </w:rPr>
-        <w:t>Stimes_2_Seconds</w:t>
-      </w:r>
-      <w:r>
-        <w:rPr>
-          <w:b/>
-        </w:rPr>
-        <w:t>.mat</w:t>
-      </w:r>
-      <w:r>
-        <w:t xml:space="preserve">. Output same folder as </w:t>
-      </w:r>
-      <w:proofErr w:type="spellStart"/>
-      <w:r>
-        <w:t>spike_times</w:t>
-      </w:r>
-      <w:proofErr w:type="spellEnd"/>
-      <w:r>
-        <w:t>. Times in ascending order always.</w:t>
-      </w:r>
-    </w:p>
-    <w:p>
-      <w:pPr>
-        <w:tabs>
-          <w:tab w:val="left" w:pos="2581"/>
-        </w:tabs>
-        <w:jc w:val="both"/>
-        <w:rPr>
-          <w:b/>
-        </w:rPr>
-      </w:pPr>
-      <w:r>
-        <w:rPr>
-          <w:b/>
-        </w:rPr>
-        <w:t>Consider running quality metrics before and after phy to help assessing units.</w:t>
+        <w:t>Do first run of quality metrics</w:t>
+      </w:r>
+    </w:p>
+    <w:p>
+      <w:pPr>
+        <w:tabs>
+          <w:tab w:val="left" w:pos="2581"/>
+        </w:tabs>
+        <w:jc w:val="both"/>
+      </w:pPr>
+      <w:r>
+        <w:t xml:space="preserve">This </w:t>
+      </w:r>
+      <w:r>
+        <w:t>help</w:t>
+      </w:r>
+      <w:r>
+        <w:t>s</w:t>
+      </w:r>
+      <w:r>
+        <w:t xml:space="preserve"> assessing units</w:t>
+      </w:r>
+      <w:r>
+        <w:t xml:space="preserve"> when using phy to curate</w:t>
+      </w:r>
+      <w:r>
+        <w:t>.</w:t>
       </w:r>
     </w:p>
     <w:p>
@@ -1405,7 +1429,6 @@
         </w:tabs>
       </w:pPr>
       <w:r>
-        <w:lastRenderedPageBreak/>
         <w:t xml:space="preserve"> “</w:t>
       </w:r>
       <w:proofErr w:type="gramStart"/>
@@ -1428,6 +1451,7 @@
           <w:i/>
           <w:u w:val="single"/>
         </w:rPr>
+        <w:lastRenderedPageBreak/>
         <w:t>Files updated by phy:</w:t>
       </w:r>
       <w:r>
@@ -1684,8 +1708,36 @@
           <w:sz w:val="28"/>
           <w:szCs w:val="28"/>
         </w:rPr>
-        <w:t>Behavioral Data</w:t>
-      </w:r>
+        <w:t>Stim</w:t>
+      </w:r>
+      <w:r>
+        <w:rPr>
+          <w:rFonts w:ascii="Arial" w:hAnsi="Arial" w:cs="Arial"/>
+          <w:b/>
+          <w:sz w:val="28"/>
+          <w:szCs w:val="28"/>
+        </w:rPr>
+        <w:t>/Playback</w:t>
+      </w:r>
+      <w:r>
+        <w:rPr>
+          <w:rFonts w:ascii="Arial" w:hAnsi="Arial" w:cs="Arial"/>
+          <w:b/>
+          <w:sz w:val="28"/>
+          <w:szCs w:val="28"/>
+        </w:rPr>
+        <w:t xml:space="preserve"> Data</w:t>
+      </w:r>
+    </w:p>
+    <w:p>
+      <w:pPr>
+        <w:rPr>
+          <w:rFonts w:ascii="Arial" w:hAnsi="Arial" w:cs="Arial"/>
+          <w:b/>
+          <w:sz w:val="28"/>
+          <w:szCs w:val="28"/>
+        </w:rPr>
+      </w:pPr>
     </w:p>
     <w:p>
       <w:pPr>
@@ -1700,19 +1752,148 @@
         <w:rPr>
           <w:b/>
         </w:rPr>
-        <w:t>Preparing the ground</w:t>
-      </w:r>
-    </w:p>
-    <w:p>
-      <w:pPr>
-        <w:jc w:val="both"/>
-      </w:pPr>
-      <w:r>
-        <w:t xml:space="preserve">Make sure folder containing playbacks is called “Playbacks” and that it contains a) All playbacks used for current recording (experiment), b) Metadata file describing how playbacks were presented, and c) Csv file specifying the order in which playbacks were presented during experiment. </w:t>
-      </w:r>
-    </w:p>
-    <w:p>
-      <w:pPr>
+        <w:t>Get</w:t>
+      </w:r>
+      <w:r>
+        <w:rPr>
+          <w:b/>
+        </w:rPr>
+        <w:t xml:space="preserve"> stimuli</w:t>
+      </w:r>
+      <w:r>
+        <w:rPr>
+          <w:b/>
+        </w:rPr>
+        <w:t xml:space="preserve"> durations </w:t>
+      </w:r>
+    </w:p>
+    <w:p>
+      <w:pPr>
+        <w:tabs>
+          <w:tab w:val="left" w:pos="2581"/>
+        </w:tabs>
+        <w:jc w:val="both"/>
+      </w:pPr>
+      <w:r>
+        <w:rPr>
+          <w:b/>
+        </w:rPr>
+        <w:t>Stim pulses:</w:t>
+      </w:r>
+      <w:r>
+        <w:rPr>
+          <w:b/>
+        </w:rPr>
+        <w:t xml:space="preserve"> </w:t>
+      </w:r>
+      <w:r>
+        <w:t xml:space="preserve">Check notes and gather information on what pulses were presented and </w:t>
+      </w:r>
+      <w:r>
+        <w:t>how many times.</w:t>
+      </w:r>
+    </w:p>
+    <w:p>
+      <w:pPr>
+        <w:tabs>
+          <w:tab w:val="left" w:pos="2581"/>
+        </w:tabs>
+        <w:jc w:val="both"/>
+      </w:pPr>
+      <w:r>
+        <w:rPr>
+          <w:b/>
+        </w:rPr>
+        <w:t>Playbacks:</w:t>
+      </w:r>
+      <w:r>
+        <w:rPr>
+          <w:b/>
+        </w:rPr>
+        <w:t xml:space="preserve"> </w:t>
+      </w:r>
+      <w:r>
+        <w:t xml:space="preserve">Run </w:t>
+      </w:r>
+      <w:proofErr w:type="spellStart"/>
+      <w:r>
+        <w:rPr>
+          <w:b/>
+        </w:rPr>
+        <w:t>playback_edges.m</w:t>
+      </w:r>
+      <w:proofErr w:type="spellEnd"/>
+      <w:r>
+        <w:t xml:space="preserve"> </w:t>
+      </w:r>
+      <w:r>
+        <w:t>to detect onset and offset of playbacks (it generates csv file)</w:t>
+      </w:r>
+      <w:r>
+        <w:t xml:space="preserve">. </w:t>
+      </w:r>
+      <w:r>
+        <w:t>Then, check if borders are correctly labelle</w:t>
+      </w:r>
+      <w:r>
+        <w:t>d</w:t>
+      </w:r>
+      <w:r>
+        <w:t>, otherwise a</w:t>
+      </w:r>
+      <w:r>
+        <w:t>djust t</w:t>
+      </w:r>
+      <w:r>
+        <w:t>hem</w:t>
+      </w:r>
+      <w:r>
+        <w:t xml:space="preserve"> manually</w:t>
+      </w:r>
+      <w:r>
+        <w:t xml:space="preserve"> and overwrite values in corresponding csv file</w:t>
+      </w:r>
+      <w:r>
+        <w:t>.</w:t>
+      </w:r>
+      <w:r>
+        <w:t xml:space="preserve"> Use Audacity or Adobe Audition to visualize the wav file and adjust borders when needed, then upda</w:t>
+      </w:r>
+      <w:r>
+        <w:t>t</w:t>
+      </w:r>
+      <w:r>
+        <w:t>e playback</w:t>
+      </w:r>
+      <w:r>
+        <w:t xml:space="preserve"> </w:t>
+      </w:r>
+      <w:r>
+        <w:t>edges output file.</w:t>
+      </w:r>
+      <w:r>
+        <w:t xml:space="preserve"> </w:t>
+      </w:r>
+    </w:p>
+    <w:p>
+      <w:pPr>
+        <w:tabs>
+          <w:tab w:val="left" w:pos="2581"/>
+        </w:tabs>
+        <w:jc w:val="both"/>
+      </w:pPr>
+      <w:r>
+        <w:t>Once durations are correct</w:t>
+      </w:r>
+      <w:r>
+        <w:t>, create a text file with 2 columns, 1 for labels and 1 for stimuli durations.</w:t>
+      </w:r>
+    </w:p>
+    <w:p>
+      <w:pPr>
+        <w:tabs>
+          <w:tab w:val="left" w:pos="2581"/>
+        </w:tabs>
         <w:jc w:val="both"/>
       </w:pPr>
     </w:p>
@@ -1723,85 +1904,170 @@
           <w:ilvl w:val="0"/>
           <w:numId w:val="5"/>
         </w:numPr>
-        <w:jc w:val="both"/>
-      </w:pPr>
-      <w:r>
-        <w:rPr>
-          <w:b/>
-        </w:rPr>
-        <w:t xml:space="preserve">Get playback durations </w:t>
-      </w:r>
-    </w:p>
-    <w:p>
-      <w:pPr>
-        <w:tabs>
-          <w:tab w:val="left" w:pos="2581"/>
-        </w:tabs>
-        <w:jc w:val="both"/>
-      </w:pPr>
-      <w:r>
-        <w:t xml:space="preserve">Run </w:t>
-      </w:r>
-      <w:proofErr w:type="spellStart"/>
-      <w:r>
-        <w:rPr>
-          <w:b/>
-        </w:rPr>
-        <w:t>playback_edges.m</w:t>
-      </w:r>
-      <w:proofErr w:type="spellEnd"/>
+        <w:tabs>
+          <w:tab w:val="left" w:pos="2581"/>
+        </w:tabs>
+        <w:jc w:val="both"/>
+      </w:pPr>
+      <w:r>
+        <w:rPr>
+          <w:b/>
+        </w:rPr>
+        <w:t xml:space="preserve">Get event times (from </w:t>
+      </w:r>
+      <w:proofErr w:type="spellStart"/>
+      <w:r>
+        <w:rPr>
+          <w:b/>
+        </w:rPr>
+        <w:t>ttls</w:t>
+      </w:r>
+      <w:proofErr w:type="spellEnd"/>
+      <w:r>
+        <w:rPr>
+          <w:b/>
+        </w:rPr>
+        <w:t xml:space="preserve">) </w:t>
+      </w:r>
+    </w:p>
+    <w:p>
+      <w:pPr>
+        <w:tabs>
+          <w:tab w:val="left" w:pos="2581"/>
+        </w:tabs>
+        <w:jc w:val="both"/>
+      </w:pPr>
+      <w:r>
+        <w:t xml:space="preserve">Typically, a </w:t>
+      </w:r>
+      <w:proofErr w:type="spellStart"/>
+      <w:r>
+        <w:t>ttl</w:t>
+      </w:r>
+      <w:proofErr w:type="spellEnd"/>
+      <w:r>
+        <w:t xml:space="preserve"> is used in at the onset of a stimulus (</w:t>
+      </w:r>
+      <w:proofErr w:type="spellStart"/>
+      <w:r>
+        <w:t>plb</w:t>
+      </w:r>
+      <w:proofErr w:type="spellEnd"/>
+      <w:r>
+        <w:t xml:space="preserve">/stim pulses). </w:t>
+      </w:r>
+      <w:proofErr w:type="spellStart"/>
+      <w:r>
+        <w:t>CatGt</w:t>
+      </w:r>
+      <w:proofErr w:type="spellEnd"/>
+      <w:r>
+        <w:t xml:space="preserve"> extracts these times in a .txt file. Alternatively, use script </w:t>
+      </w:r>
+      <w:proofErr w:type="spellStart"/>
+      <w:r>
+        <w:rPr>
+          <w:b/>
+          <w:i/>
+        </w:rPr>
+        <w:t>extract_ttl_</w:t>
+      </w:r>
+      <w:proofErr w:type="gramStart"/>
+      <w:r>
+        <w:rPr>
+          <w:b/>
+          <w:i/>
+        </w:rPr>
+        <w:t>events.ipynb</w:t>
+      </w:r>
+      <w:proofErr w:type="spellEnd"/>
+      <w:proofErr w:type="gramEnd"/>
+      <w:r>
+        <w:t>.</w:t>
+      </w:r>
+    </w:p>
+    <w:p>
+      <w:pPr>
+        <w:tabs>
+          <w:tab w:val="left" w:pos="2581"/>
+        </w:tabs>
+        <w:jc w:val="both"/>
+      </w:pPr>
+      <w:r>
+        <w:t xml:space="preserve">It is important to confirm that the number of </w:t>
+      </w:r>
+      <w:proofErr w:type="spellStart"/>
+      <w:r>
+        <w:t>ttl</w:t>
+      </w:r>
+      <w:proofErr w:type="spellEnd"/>
+      <w:r>
+        <w:t xml:space="preserve"> events obtained corresponds to the actual times a stimulus was used. For this, the same script </w:t>
+      </w:r>
+      <w:proofErr w:type="spellStart"/>
+      <w:r>
+        <w:t>extract_ttl_events</w:t>
+      </w:r>
+      <w:proofErr w:type="spellEnd"/>
+      <w:r>
+        <w:t xml:space="preserve"> can be used. </w:t>
+      </w:r>
+    </w:p>
+    <w:p>
+      <w:pPr>
+        <w:tabs>
+          <w:tab w:val="left" w:pos="2581"/>
+        </w:tabs>
+        <w:jc w:val="both"/>
+      </w:pPr>
+      <w:r>
+        <w:t xml:space="preserve">To crosscheck if a given </w:t>
+      </w:r>
+      <w:proofErr w:type="spellStart"/>
+      <w:r>
+        <w:t>ttl</w:t>
+      </w:r>
+      <w:proofErr w:type="spellEnd"/>
+      <w:r>
+        <w:t xml:space="preserve"> corresponds to a real playback use </w:t>
+      </w:r>
+      <w:proofErr w:type="spellStart"/>
+      <w:r>
+        <w:t>SpikeGlx</w:t>
+      </w:r>
+      <w:proofErr w:type="spellEnd"/>
+      <w:r>
+        <w:t xml:space="preserve"> File Viewer or the exported wav file from the channel of interest. </w:t>
+      </w:r>
+    </w:p>
+    <w:p>
+      <w:pPr>
+        <w:tabs>
+          <w:tab w:val="left" w:pos="2581"/>
+        </w:tabs>
+        <w:jc w:val="both"/>
+      </w:pPr>
+      <w:r>
+        <w:t xml:space="preserve">Once .txt file is </w:t>
+      </w:r>
+      <w:r>
+        <w:t>curated</w:t>
+      </w:r>
+      <w:r>
+        <w:t>, the script will create a</w:t>
+      </w:r>
       <w:r>
         <w:t xml:space="preserve"> </w:t>
       </w:r>
       <w:r>
-        <w:t>to detect onset and offset of playbacks (it generates csv file)</w:t>
-      </w:r>
-      <w:r>
-        <w:t xml:space="preserve">. </w:t>
-      </w:r>
-      <w:r>
-        <w:t>Then, check if borders are correctly labelle</w:t>
-      </w:r>
-      <w:r>
-        <w:t>d</w:t>
-      </w:r>
-      <w:r>
-        <w:t>, otherwise a</w:t>
-      </w:r>
-      <w:r>
-        <w:t>djust t</w:t>
-      </w:r>
-      <w:r>
-        <w:t>hem</w:t>
-      </w:r>
-      <w:r>
-        <w:t xml:space="preserve"> manually</w:t>
-      </w:r>
-      <w:r>
-        <w:t xml:space="preserve"> and overwrite values in corresponding csv file</w:t>
-      </w:r>
-      <w:r>
-        <w:t xml:space="preserve">. </w:t>
-      </w:r>
-    </w:p>
-    <w:p>
-      <w:pPr>
-        <w:tabs>
-          <w:tab w:val="left" w:pos="2581"/>
-        </w:tabs>
-        <w:jc w:val="both"/>
-      </w:pPr>
-      <w:r>
-        <w:t xml:space="preserve">Once durations are correct add them to the playbacks meta file (with new line separation). Include playback name and duration. </w:t>
-      </w:r>
-    </w:p>
-    <w:p>
-      <w:pPr>
-        <w:tabs>
-          <w:tab w:val="left" w:pos="2581"/>
-        </w:tabs>
-        <w:jc w:val="both"/>
-      </w:pPr>
+        <w:t>.txt file with the onsets</w:t>
+      </w:r>
+      <w:r>
+        <w:t xml:space="preserve"> of all stimuli presented</w:t>
+      </w:r>
+      <w:r>
+        <w:t>. All event times must be in ascending order.</w:t>
+      </w:r>
     </w:p>
     <w:p>
       <w:pPr>
@@ -1810,88 +2076,122 @@
           <w:ilvl w:val="0"/>
           <w:numId w:val="5"/>
         </w:numPr>
-        <w:tabs>
-          <w:tab w:val="left" w:pos="2581"/>
-        </w:tabs>
-        <w:jc w:val="both"/>
-      </w:pPr>
-      <w:r>
-        <w:rPr>
-          <w:b/>
-        </w:rPr>
-        <w:t>Get playback times (as presented during experiment)</w:t>
-      </w:r>
-    </w:p>
-    <w:p>
-      <w:pPr>
-        <w:tabs>
-          <w:tab w:val="left" w:pos="2581"/>
-        </w:tabs>
-        <w:jc w:val="both"/>
-      </w:pPr>
-      <w:r>
-        <w:t xml:space="preserve">A </w:t>
-      </w:r>
-      <w:proofErr w:type="spellStart"/>
-      <w:r>
-        <w:t>ttl</w:t>
-      </w:r>
-      <w:proofErr w:type="spellEnd"/>
-      <w:r>
-        <w:t xml:space="preserve"> is used in analog channel 4</w:t>
-      </w:r>
-      <w:r>
-        <w:t>,</w:t>
-      </w:r>
-      <w:r>
-        <w:t xml:space="preserve"> triggering at the onset of each playback. </w:t>
-      </w:r>
-      <w:proofErr w:type="spellStart"/>
-      <w:r>
-        <w:t>CatGt</w:t>
-      </w:r>
-      <w:proofErr w:type="spellEnd"/>
-      <w:r>
-        <w:t xml:space="preserve"> extracts these times in a .txt format. Check if number of </w:t>
-      </w:r>
-      <w:proofErr w:type="spellStart"/>
-      <w:r>
-        <w:t>ttl</w:t>
-      </w:r>
-      <w:proofErr w:type="spellEnd"/>
-      <w:r>
-        <w:t xml:space="preserve"> events corresponds to the actual times playbacks were presented (verify this in csv playback summary file</w:t>
-      </w:r>
-      <w:r>
-        <w:t>, just be careful not counting catch trials</w:t>
-      </w:r>
-      <w:r>
-        <w:t xml:space="preserve">). If there are inconsistencies, load .txt file in </w:t>
-      </w:r>
-      <w:proofErr w:type="spellStart"/>
-      <w:r>
-        <w:t>matlab</w:t>
-      </w:r>
-      <w:proofErr w:type="spellEnd"/>
-      <w:r>
-        <w:t xml:space="preserve"> using </w:t>
-      </w:r>
-      <w:proofErr w:type="spellStart"/>
-      <w:r>
-        <w:rPr>
-          <w:b/>
-        </w:rPr>
-        <w:t>audio_edges_ttl.mlx</w:t>
-      </w:r>
-      <w:proofErr w:type="spellEnd"/>
-      <w:r>
-        <w:rPr>
-          <w:b/>
-        </w:rPr>
+        <w:jc w:val="both"/>
+      </w:pPr>
+      <w:r>
+        <w:rPr>
+          <w:b/>
+        </w:rPr>
+        <w:lastRenderedPageBreak/>
+        <w:t>Synchronize st</w:t>
+      </w:r>
+      <w:r>
+        <w:rPr>
+          <w:b/>
+        </w:rPr>
+        <w:t>imuli</w:t>
+      </w:r>
+      <w:r>
+        <w:rPr>
+          <w:b/>
+        </w:rPr>
+        <w:t xml:space="preserve"> times with neural data</w:t>
+      </w:r>
+    </w:p>
+    <w:p>
+      <w:pPr>
+        <w:jc w:val="both"/>
+      </w:pPr>
+      <w:r>
+        <w:t xml:space="preserve">Use </w:t>
+      </w:r>
+      <w:proofErr w:type="spellStart"/>
+      <w:r>
+        <w:t>TPrime</w:t>
+      </w:r>
+      <w:proofErr w:type="spellEnd"/>
+      <w:r>
+        <w:t xml:space="preserve"> to translate event times so that they are aligned with spike times. Times must always be written in ascending order. Use </w:t>
+      </w:r>
+      <w:proofErr w:type="spellStart"/>
+      <w:r>
+        <w:rPr>
+          <w:i/>
+        </w:rPr>
+        <w:t>TPrime_runit_example</w:t>
+      </w:r>
+      <w:proofErr w:type="spellEnd"/>
+      <w:r>
         <w:t xml:space="preserve"> </w:t>
       </w:r>
       <w:r>
-        <w:t xml:space="preserve">and detect possible artifact </w:t>
+        <w:t xml:space="preserve">file </w:t>
+      </w:r>
+      <w:r>
+        <w:t>contents as a guide to fill in new information. Run batch file. Output will be a new .txt file with aligned times</w:t>
+      </w:r>
+      <w:r>
+        <w:t xml:space="preserve"> and ending in _</w:t>
+      </w:r>
+      <w:proofErr w:type="spellStart"/>
+      <w:r>
+        <w:t>tprime</w:t>
+      </w:r>
+      <w:proofErr w:type="spellEnd"/>
+      <w:r>
+        <w:t xml:space="preserve">. </w:t>
+      </w:r>
+    </w:p>
+    <w:p>
+      <w:pPr>
+        <w:jc w:val="both"/>
+        <w:rPr>
+          <w:b/>
+        </w:rPr>
+      </w:pPr>
+      <w:r>
+        <w:rPr>
+          <w:b/>
+        </w:rPr>
+        <w:t>Parameters:</w:t>
+      </w:r>
+    </w:p>
+    <w:p>
+      <w:pPr>
+        <w:ind w:left="360"/>
+        <w:jc w:val="both"/>
+      </w:pPr>
+      <w:proofErr w:type="spellStart"/>
+      <w:r>
+        <w:rPr>
+          <w:b/>
+        </w:rPr>
+        <w:t>toStream</w:t>
+      </w:r>
+      <w:proofErr w:type="spellEnd"/>
+      <w:r>
+        <w:rPr>
+          <w:b/>
+        </w:rPr>
+        <w:t>:</w:t>
+      </w:r>
+      <w:r>
+        <w:t xml:space="preserve"> </w:t>
+      </w:r>
+      <w:r>
+        <w:t>path and</w:t>
+      </w:r>
+      <w:r>
+        <w:t xml:space="preserve"> </w:t>
+      </w:r>
+      <w:r>
+        <w:t xml:space="preserve">.txt file with </w:t>
+      </w:r>
+      <w:r>
+        <w:t>sync</w:t>
+      </w:r>
+      <w:r>
+        <w:t xml:space="preserve"> </w:t>
       </w:r>
       <w:proofErr w:type="spellStart"/>
       <w:r>
@@ -1899,214 +2199,148 @@
       </w:r>
       <w:proofErr w:type="spellEnd"/>
       <w:r>
-        <w:t xml:space="preserve"> </w:t>
-      </w:r>
-      <w:r>
-        <w:t>(</w:t>
-      </w:r>
-      <w:r>
-        <w:rPr>
-          <w:i/>
-        </w:rPr>
-        <w:t xml:space="preserve">use </w:t>
-      </w:r>
-      <w:r>
-        <w:rPr>
-          <w:i/>
-        </w:rPr>
-        <w:lastRenderedPageBreak/>
-        <w:t>plot(diff(</w:t>
-      </w:r>
-      <w:proofErr w:type="spellStart"/>
-      <w:r>
-        <w:rPr>
-          <w:i/>
-        </w:rPr>
-        <w:t>plb_onsets</w:t>
-      </w:r>
-      <w:proofErr w:type="spellEnd"/>
-      <w:r>
-        <w:rPr>
-          <w:i/>
-        </w:rPr>
-        <w:t>))</w:t>
-      </w:r>
-      <w:r>
-        <w:t>)</w:t>
+        <w:t xml:space="preserve"> from </w:t>
+      </w:r>
+      <w:r>
+        <w:rPr>
+          <w:b/>
+        </w:rPr>
+        <w:t>ap</w:t>
       </w:r>
       <w:r>
         <w:t xml:space="preserve">. </w:t>
       </w:r>
-      <w:r>
-        <w:t xml:space="preserve">To crosscheck if a given </w:t>
-      </w:r>
-      <w:proofErr w:type="spellStart"/>
-      <w:r>
-        <w:t>ttl</w:t>
-      </w:r>
-      <w:proofErr w:type="spellEnd"/>
-      <w:r>
-        <w:t xml:space="preserve"> corresponds to a real playback use </w:t>
-      </w:r>
-      <w:proofErr w:type="spellStart"/>
-      <w:r>
-        <w:t>SpikeGlx</w:t>
-      </w:r>
-      <w:proofErr w:type="spellEnd"/>
-      <w:r>
-        <w:t xml:space="preserve"> File Viewer. </w:t>
-      </w:r>
-      <w:r>
-        <w:t>Curate .txt file.</w:t>
-      </w:r>
-    </w:p>
-    <w:p>
-      <w:pPr>
-        <w:tabs>
-          <w:tab w:val="left" w:pos="2581"/>
-        </w:tabs>
-        <w:jc w:val="both"/>
-      </w:pPr>
-      <w:r>
-        <w:t xml:space="preserve">Once .txt file is correct, finish running </w:t>
-      </w:r>
-      <w:proofErr w:type="spellStart"/>
-      <w:r>
-        <w:rPr>
-          <w:b/>
-        </w:rPr>
-        <w:t>audio_edges_ttl.mlx</w:t>
-      </w:r>
-      <w:proofErr w:type="spellEnd"/>
-      <w:r>
-        <w:rPr>
-          <w:b/>
-        </w:rPr>
-        <w:t xml:space="preserve"> </w:t>
-      </w:r>
-      <w:r>
-        <w:t>to get a csv file with onsets and offsets of all playbacks presented during experiment. File also gives .txt file called stims_seconds</w:t>
-      </w:r>
-      <w:r>
-        <w:t>.txt with onsets and offsets in ascending order</w:t>
-      </w:r>
+    </w:p>
+    <w:p>
+      <w:pPr>
+        <w:ind w:left="360"/>
+        <w:jc w:val="both"/>
+      </w:pPr>
+      <w:proofErr w:type="spellStart"/>
+      <w:r>
+        <w:rPr>
+          <w:b/>
+        </w:rPr>
+        <w:t>fromStream</w:t>
+      </w:r>
+      <w:proofErr w:type="spellEnd"/>
+      <w:r>
+        <w:rPr>
+          <w:b/>
+        </w:rPr>
+        <w:t>:</w:t>
+      </w:r>
+      <w:r>
+        <w:t xml:space="preserve"> path and </w:t>
+      </w:r>
+      <w:r>
+        <w:t xml:space="preserve">.txt file with </w:t>
+      </w:r>
+      <w:r>
+        <w:t xml:space="preserve">sync </w:t>
+      </w:r>
+      <w:proofErr w:type="spellStart"/>
+      <w:r>
+        <w:t>ttls</w:t>
+      </w:r>
+      <w:proofErr w:type="spellEnd"/>
+      <w:r>
+        <w:t xml:space="preserve"> from </w:t>
+      </w:r>
+      <w:proofErr w:type="spellStart"/>
+      <w:r>
+        <w:rPr>
+          <w:b/>
+        </w:rPr>
+        <w:t>ni</w:t>
+      </w:r>
+      <w:proofErr w:type="spellEnd"/>
+      <w:r>
+        <w:t xml:space="preserve"> or </w:t>
+      </w:r>
+      <w:proofErr w:type="spellStart"/>
+      <w:r>
+        <w:rPr>
+          <w:b/>
+        </w:rPr>
+        <w:t>obx</w:t>
+      </w:r>
+      <w:proofErr w:type="spellEnd"/>
       <w:r>
         <w:t>.</w:t>
       </w:r>
     </w:p>
     <w:p>
       <w:pPr>
-        <w:jc w:val="both"/>
-      </w:pPr>
-      <w:r>
-        <w:rPr>
-          <w:i/>
-        </w:rPr>
-        <w:t xml:space="preserve">Troubleshooting: </w:t>
-      </w:r>
-      <w:r>
-        <w:t xml:space="preserve">In case of need to confirm that </w:t>
-      </w:r>
-      <w:proofErr w:type="spellStart"/>
-      <w:r>
-        <w:t>ttls</w:t>
-      </w:r>
-      <w:proofErr w:type="spellEnd"/>
-      <w:r>
-        <w:t xml:space="preserve"> really correspond to playback onsets, run </w:t>
-      </w:r>
-      <w:r>
-        <w:rPr>
-          <w:b/>
-          <w:i/>
-        </w:rPr>
-        <w:t xml:space="preserve">a0 explorer </w:t>
-      </w:r>
-      <w:proofErr w:type="spellStart"/>
-      <w:r>
-        <w:rPr>
-          <w:b/>
-          <w:i/>
-        </w:rPr>
-        <w:t>function.mlx</w:t>
-      </w:r>
-      <w:proofErr w:type="spellEnd"/>
-      <w:r>
-        <w:rPr>
-          <w:b/>
-          <w:i/>
-        </w:rPr>
+        <w:ind w:left="360"/>
+        <w:jc w:val="both"/>
+      </w:pPr>
+      <w:r>
+        <w:rPr>
+          <w:b/>
+        </w:rPr>
+        <w:t>events:</w:t>
+      </w:r>
+      <w:r>
+        <w:t xml:space="preserve"> path and .txt file with event times, and path and file name of new </w:t>
+      </w:r>
+      <w:r>
+        <w:t>_</w:t>
+      </w:r>
+      <w:proofErr w:type="spellStart"/>
+      <w:r>
+        <w:t>tprime</w:t>
+      </w:r>
+      <w:proofErr w:type="spellEnd"/>
+      <w:r>
+        <w:t xml:space="preserve"> document</w:t>
+      </w:r>
+      <w:r>
         <w:t xml:space="preserve">. </w:t>
       </w:r>
-      <w:r>
-        <w:t xml:space="preserve">It will plot all </w:t>
-      </w:r>
-      <w:proofErr w:type="spellStart"/>
-      <w:r>
-        <w:t>ttl</w:t>
-      </w:r>
-      <w:proofErr w:type="spellEnd"/>
-      <w:r>
-        <w:t xml:space="preserve"> events in a spectrogram showing what sound was present during that window of time. For this to work, always e</w:t>
-      </w:r>
-      <w:r>
-        <w:t xml:space="preserve">xtract </w:t>
-      </w:r>
-      <w:r>
-        <w:t>first audio recorded during experiment from corresponding a</w:t>
-      </w:r>
-      <w:r>
-        <w:t>nalog channel</w:t>
-      </w:r>
-      <w:r>
-        <w:t xml:space="preserve"> (a0)</w:t>
-      </w:r>
-      <w:r>
-        <w:t xml:space="preserve">: Run </w:t>
-      </w:r>
-      <w:r>
-        <w:rPr>
-          <w:b/>
-        </w:rPr>
-        <w:t>loadNI_A0.m</w:t>
-      </w:r>
-      <w:r>
-        <w:t xml:space="preserve"> </w:t>
-      </w:r>
-      <w:r>
-        <w:t xml:space="preserve">or </w:t>
-      </w:r>
-      <w:r>
-        <w:rPr>
-          <w:b/>
-        </w:rPr>
-        <w:t>loadObx_a0.m</w:t>
-      </w:r>
-      <w:r>
-        <w:t xml:space="preserve"> script.</w:t>
-      </w:r>
-      <w:r>
-        <w:t xml:space="preserve"> Choose metafile that is in same location as </w:t>
-      </w:r>
-      <w:proofErr w:type="spellStart"/>
-      <w:r>
-        <w:t>ni.bin</w:t>
-      </w:r>
-      <w:proofErr w:type="spellEnd"/>
-      <w:r>
-        <w:t xml:space="preserve"> or </w:t>
-      </w:r>
-      <w:proofErr w:type="spellStart"/>
-      <w:r>
-        <w:t>obx.bin</w:t>
-      </w:r>
-      <w:proofErr w:type="spellEnd"/>
-      <w:r>
-        <w:t>. Note that script assumes microphone comes from A0 analog channel.</w:t>
-      </w:r>
-    </w:p>
-    <w:p>
-      <w:pPr>
+    </w:p>
+    <w:p>
+      <w:pPr>
+        <w:tabs>
+          <w:tab w:val="left" w:pos="2581"/>
+        </w:tabs>
+        <w:jc w:val="both"/>
+      </w:pPr>
+      <w:r>
+        <w:t xml:space="preserve">Notes: When writing events in </w:t>
+      </w:r>
+      <w:proofErr w:type="spellStart"/>
+      <w:r>
+        <w:t>TPrime</w:t>
+      </w:r>
+      <w:proofErr w:type="spellEnd"/>
+      <w:r>
+        <w:t xml:space="preserve"> specify </w:t>
+      </w:r>
+      <w:r>
+        <w:rPr>
+          <w:b/>
+        </w:rPr>
+        <w:t>input</w:t>
+      </w:r>
+      <w:r>
+        <w:t xml:space="preserve"> and </w:t>
+      </w:r>
+      <w:r>
+        <w:rPr>
+          <w:b/>
+        </w:rPr>
+        <w:t>output</w:t>
+      </w:r>
+      <w:r>
+        <w:t xml:space="preserve"> separated by a comma (,).</w:t>
+      </w:r>
+    </w:p>
+    <w:p>
+      <w:pPr>
+        <w:tabs>
+          <w:tab w:val="left" w:pos="2581"/>
+        </w:tabs>
         <w:jc w:val="both"/>
       </w:pPr>
     </w:p>
@@ -2117,103 +2351,202 @@
           <w:ilvl w:val="0"/>
           <w:numId w:val="5"/>
         </w:numPr>
-        <w:jc w:val="both"/>
-      </w:pPr>
-      <w:r>
-        <w:rPr>
-          <w:b/>
-        </w:rPr>
-        <w:t>Synchronize stim</w:t>
-      </w:r>
-      <w:r>
-        <w:rPr>
-          <w:b/>
-        </w:rPr>
-        <w:t>s</w:t>
-      </w:r>
-      <w:r>
-        <w:rPr>
-          <w:b/>
-        </w:rPr>
-        <w:t xml:space="preserve"> times</w:t>
-      </w:r>
-      <w:r>
-        <w:rPr>
-          <w:b/>
-        </w:rPr>
-        <w:t xml:space="preserve"> (playbacks) with neural data</w:t>
-      </w:r>
-    </w:p>
-    <w:p>
-      <w:pPr>
-        <w:jc w:val="both"/>
-      </w:pPr>
-      <w:r>
-        <w:t xml:space="preserve">Use </w:t>
-      </w:r>
-      <w:proofErr w:type="spellStart"/>
-      <w:r>
-        <w:t>TPrime</w:t>
-      </w:r>
-      <w:proofErr w:type="spellEnd"/>
-      <w:r>
-        <w:t xml:space="preserve"> to translate playback event times so that they are aligned with spike times. Times must always be written in ascending order. Use </w:t>
-      </w:r>
-      <w:proofErr w:type="spellStart"/>
-      <w:r>
-        <w:t>Tprime-runit</w:t>
-      </w:r>
-      <w:proofErr w:type="spellEnd"/>
-      <w:r>
-        <w:t xml:space="preserve"> contents as a guide to fill in new information. Run batch file. Output will be a new .txt file with aligned times. </w:t>
-      </w:r>
-    </w:p>
-    <w:p>
-      <w:pPr>
-        <w:jc w:val="both"/>
-      </w:pPr>
-      <w:r>
-        <w:t xml:space="preserve">Notes: When writing to </w:t>
-      </w:r>
-      <w:proofErr w:type="spellStart"/>
-      <w:r>
-        <w:t>TPrime</w:t>
-      </w:r>
-      <w:proofErr w:type="spellEnd"/>
-      <w:r>
-        <w:t xml:space="preserve"> specify for events </w:t>
-      </w:r>
-      <w:r>
-        <w:rPr>
-          <w:b/>
-        </w:rPr>
-        <w:t>input</w:t>
-      </w:r>
-      <w:r>
-        <w:t xml:space="preserve"> and </w:t>
-      </w:r>
-      <w:r>
-        <w:rPr>
-          <w:b/>
-        </w:rPr>
-        <w:t>output</w:t>
-      </w:r>
-      <w:r>
-        <w:t xml:space="preserve"> separated by comma. </w:t>
-      </w:r>
-    </w:p>
-    <w:p>
-      <w:pPr>
-        <w:ind w:left="360"/>
-        <w:jc w:val="both"/>
-      </w:pPr>
-      <w:proofErr w:type="spellStart"/>
-      <w:r>
-        <w:t>toStream</w:t>
-      </w:r>
-      <w:proofErr w:type="spellEnd"/>
-      <w:r>
-        <w:t xml:space="preserve">: path and file for .txt file with </w:t>
+        <w:tabs>
+          <w:tab w:val="left" w:pos="2581"/>
+        </w:tabs>
+        <w:jc w:val="both"/>
+        <w:rPr>
+          <w:b/>
+        </w:rPr>
+      </w:pPr>
+      <w:r>
+        <w:rPr>
+          <w:b/>
+        </w:rPr>
+        <w:t>Assemble summary csv with event times and labels</w:t>
+      </w:r>
+    </w:p>
+    <w:p>
+      <w:pPr>
+        <w:jc w:val="both"/>
+      </w:pPr>
+      <w:r>
+        <w:t>U</w:t>
+      </w:r>
+      <w:r>
+        <w:t>se</w:t>
+      </w:r>
+      <w:r>
+        <w:t xml:space="preserve"> script </w:t>
+      </w:r>
+      <w:proofErr w:type="spellStart"/>
+      <w:r>
+        <w:rPr>
+          <w:b/>
+          <w:i/>
+        </w:rPr>
+        <w:t>create_event_</w:t>
+      </w:r>
+      <w:proofErr w:type="gramStart"/>
+      <w:r>
+        <w:rPr>
+          <w:b/>
+          <w:i/>
+        </w:rPr>
+        <w:t>csv.ipynb</w:t>
+      </w:r>
+      <w:proofErr w:type="spellEnd"/>
+      <w:proofErr w:type="gramEnd"/>
+      <w:r>
+        <w:t xml:space="preserve"> to generate a csv file with event onset times</w:t>
+      </w:r>
+      <w:r>
+        <w:t xml:space="preserve">, </w:t>
+      </w:r>
+      <w:proofErr w:type="spellStart"/>
+      <w:r>
+        <w:t>tprime</w:t>
+      </w:r>
+      <w:proofErr w:type="spellEnd"/>
+      <w:r>
+        <w:t xml:space="preserve"> times and</w:t>
+      </w:r>
+      <w:r>
+        <w:t xml:space="preserve"> corresponding labels. Follow the instructions depending on the event type in use:</w:t>
+      </w:r>
+    </w:p>
+    <w:p>
+      <w:pPr>
+        <w:jc w:val="both"/>
+      </w:pPr>
+      <w:r>
+        <w:rPr>
+          <w:b/>
+        </w:rPr>
+        <w:t>Stim pulses:</w:t>
+      </w:r>
+      <w:r>
+        <w:t xml:space="preserve"> </w:t>
+      </w:r>
+      <w:r>
+        <w:t>Use notes from</w:t>
+      </w:r>
+      <w:r>
+        <w:t xml:space="preserve"> Stim_experiment_Form_M9</w:t>
+      </w:r>
+      <w:r>
+        <w:t>.csv to specify in the script</w:t>
+      </w:r>
+      <w:r>
+        <w:t xml:space="preserve"> </w:t>
+      </w:r>
+      <w:r>
+        <w:t xml:space="preserve">how many times each stimulus was presented. </w:t>
+      </w:r>
+      <w:r>
+        <w:t>More details in script.</w:t>
+      </w:r>
+    </w:p>
+    <w:p>
+      <w:pPr>
+        <w:jc w:val="both"/>
+      </w:pPr>
+      <w:r>
+        <w:rPr>
+          <w:b/>
+        </w:rPr>
+        <w:t>Playbacks:</w:t>
+      </w:r>
+      <w:r>
+        <w:t xml:space="preserve"> </w:t>
+      </w:r>
+      <w:r>
+        <w:t>Confirm the existence of a)</w:t>
+      </w:r>
+      <w:r>
+        <w:t xml:space="preserve"> “Playbacks” folder</w:t>
+      </w:r>
+      <w:r>
+        <w:t xml:space="preserve"> </w:t>
+      </w:r>
+      <w:r>
+        <w:t xml:space="preserve">and that it contains </w:t>
+      </w:r>
+      <w:r>
+        <w:t>a</w:t>
+      </w:r>
+      <w:r>
+        <w:t>ll playbacks used for current recording (experiment), b) Metadata file describing how playbacks were presented, and c) Csv file specifying the order in which playbacks were presented during experiment</w:t>
+      </w:r>
+      <w:r>
+        <w:t xml:space="preserve"> and their labels</w:t>
+      </w:r>
+      <w:r>
+        <w:t xml:space="preserve">. </w:t>
+      </w:r>
+      <w:r>
+        <w:t xml:space="preserve">If the csv file is not in the same location as the </w:t>
+      </w:r>
+      <w:proofErr w:type="spellStart"/>
+      <w:r>
+        <w:t>ttl_event</w:t>
+      </w:r>
+      <w:proofErr w:type="spellEnd"/>
+      <w:r>
+        <w:t xml:space="preserve"> times extracted before, make a copy there.</w:t>
+      </w:r>
+      <w:r>
+        <w:t xml:space="preserve"> </w:t>
+      </w:r>
+    </w:p>
+    <w:p>
+      <w:pPr>
+        <w:tabs>
+          <w:tab w:val="left" w:pos="2581"/>
+        </w:tabs>
+        <w:jc w:val="both"/>
+      </w:pPr>
+    </w:p>
+    <w:p>
+      <w:pPr>
+        <w:pStyle w:val="ListParagraph"/>
+        <w:numPr>
+          <w:ilvl w:val="0"/>
+          <w:numId w:val="5"/>
+        </w:numPr>
+        <w:tabs>
+          <w:tab w:val="left" w:pos="2581"/>
+        </w:tabs>
+        <w:jc w:val="both"/>
+        <w:rPr>
+          <w:b/>
+        </w:rPr>
+      </w:pPr>
+      <w:r>
+        <w:rPr>
+          <w:b/>
+        </w:rPr>
+        <w:t>Sanity check</w:t>
+      </w:r>
+    </w:p>
+    <w:p>
+      <w:pPr>
+        <w:tabs>
+          <w:tab w:val="left" w:pos="2581"/>
+        </w:tabs>
+        <w:jc w:val="both"/>
+      </w:pPr>
+      <w:r>
+        <w:t>T</w:t>
+      </w:r>
+      <w:r>
+        <w:t>o confirm</w:t>
+      </w:r>
+      <w:r>
+        <w:rPr>
+          <w:i/>
+        </w:rPr>
+        <w:t xml:space="preserve"> that </w:t>
       </w:r>
       <w:proofErr w:type="spellStart"/>
       <w:r>
@@ -2221,152 +2554,57 @@
       </w:r>
       <w:proofErr w:type="spellEnd"/>
       <w:r>
-        <w:t xml:space="preserve"> from </w:t>
-      </w:r>
-      <w:r>
-        <w:rPr>
-          <w:b/>
-        </w:rPr>
-        <w:t>ap</w:t>
-      </w:r>
-      <w:r>
+        <w:t xml:space="preserve"> really correspond to stimuli onsets, </w:t>
+      </w:r>
+      <w:proofErr w:type="gramStart"/>
+      <w:r>
+        <w:t>run ?</w:t>
+      </w:r>
+      <w:proofErr w:type="gramEnd"/>
+      <w:r>
+        <w:t>??</w:t>
+      </w:r>
+      <w:r>
+        <w:rPr>
+          <w:b/>
+          <w:i/>
+        </w:rPr>
         <w:t xml:space="preserve">. </w:t>
       </w:r>
-    </w:p>
-    <w:p>
-      <w:pPr>
-        <w:ind w:left="360"/>
-        <w:jc w:val="both"/>
-      </w:pPr>
-      <w:proofErr w:type="spellStart"/>
-      <w:r>
-        <w:t>fromStream</w:t>
-      </w:r>
-      <w:proofErr w:type="spellEnd"/>
-      <w:r>
-        <w:t xml:space="preserve">: path and file for .txt file with </w:t>
-      </w:r>
-      <w:proofErr w:type="spellStart"/>
-      <w:r>
-        <w:t>ttls</w:t>
-      </w:r>
-      <w:proofErr w:type="spellEnd"/>
-      <w:r>
-        <w:t xml:space="preserve"> from </w:t>
-      </w:r>
-      <w:proofErr w:type="spellStart"/>
-      <w:r>
-        <w:rPr>
-          <w:b/>
-        </w:rPr>
-        <w:t>ni</w:t>
-      </w:r>
-      <w:proofErr w:type="spellEnd"/>
-      <w:r>
-        <w:t xml:space="preserve"> or </w:t>
-      </w:r>
-      <w:proofErr w:type="spellStart"/>
-      <w:r>
-        <w:rPr>
-          <w:b/>
-        </w:rPr>
-        <w:t>obx</w:t>
-      </w:r>
-      <w:proofErr w:type="spellEnd"/>
-      <w:r>
-        <w:t>.</w:t>
-      </w:r>
-    </w:p>
-    <w:p>
-      <w:pPr>
-        <w:ind w:left="360"/>
-        <w:jc w:val="both"/>
-      </w:pPr>
-      <w:r>
-        <w:t>e</w:t>
-      </w:r>
-      <w:r>
-        <w:t xml:space="preserve">vents: path and file of .txt file with event times, and path and file name of new file with aligned event times. </w:t>
-      </w:r>
-    </w:p>
-    <w:p>
-      <w:pPr>
-        <w:jc w:val="both"/>
-      </w:pPr>
-      <w:r>
-        <w:rPr>
-          <w:i/>
-        </w:rPr>
-        <w:t xml:space="preserve">Finally, </w:t>
-      </w:r>
-      <w:r>
-        <w:t xml:space="preserve">update values on csv table </w:t>
-      </w:r>
-      <w:proofErr w:type="spellStart"/>
-      <w:r>
-        <w:t>stims_seconds_summary</w:t>
-      </w:r>
-      <w:proofErr w:type="spellEnd"/>
-      <w:r>
-        <w:t xml:space="preserve"> using </w:t>
-      </w:r>
-      <w:proofErr w:type="spellStart"/>
-      <w:r>
-        <w:rPr>
-          <w:b/>
-          <w:i/>
-        </w:rPr>
-        <w:t>stim_t_prime</w:t>
-      </w:r>
-      <w:r>
-        <w:rPr>
-          <w:b/>
-          <w:i/>
-        </w:rPr>
-        <w:t>.m</w:t>
-      </w:r>
-      <w:proofErr w:type="spellEnd"/>
-      <w:r>
-        <w:rPr>
-          <w:b/>
-          <w:i/>
-        </w:rPr>
-        <w:t>.</w:t>
-      </w:r>
-      <w:r>
-        <w:t xml:space="preserve"> It just adds a new column with T prime info</w:t>
-      </w:r>
-      <w:r>
-        <w:t xml:space="preserve"> and saves a new updated csv file</w:t>
-      </w:r>
-      <w:r>
-        <w:t xml:space="preserve">. If there are playbacks to eliminate due to noise, </w:t>
-      </w:r>
-      <w:r>
-        <w:rPr>
-          <w:b/>
-        </w:rPr>
-        <w:t>add exceptions</w:t>
-      </w:r>
-      <w:r>
-        <w:t xml:space="preserve"> column on </w:t>
-      </w:r>
-      <w:r>
-        <w:rPr>
-          <w:b/>
-        </w:rPr>
-        <w:t>stims_seconds_summary_updated.csv</w:t>
-      </w:r>
-      <w:r>
-        <w:t xml:space="preserve"> file and write a 0 on </w:t>
-      </w:r>
-      <w:proofErr w:type="gramStart"/>
-      <w:r>
-        <w:t>the  to</w:t>
-      </w:r>
-      <w:proofErr w:type="gramEnd"/>
-      <w:r>
-        <w:t xml:space="preserve"> eliminate. </w:t>
+      <w:r>
+        <w:t xml:space="preserve">It will plot all </w:t>
+      </w:r>
+      <w:proofErr w:type="spellStart"/>
+      <w:r>
+        <w:t>ttl</w:t>
+      </w:r>
+      <w:proofErr w:type="spellEnd"/>
+      <w:r>
+        <w:t xml:space="preserve"> events</w:t>
+      </w:r>
+      <w:r>
+        <w:t xml:space="preserve"> plus the corresponding time</w:t>
+      </w:r>
+      <w:r>
+        <w:t xml:space="preserve"> in a spectrogram/waveform.</w:t>
+      </w:r>
+      <w:bookmarkStart w:id="0" w:name="_GoBack"/>
+      <w:bookmarkEnd w:id="0"/>
+    </w:p>
+    <w:p>
+      <w:pPr>
+        <w:tabs>
+          <w:tab w:val="left" w:pos="2581"/>
+        </w:tabs>
+        <w:jc w:val="both"/>
+      </w:pPr>
+    </w:p>
+    <w:p>
+      <w:pPr>
+        <w:jc w:val="both"/>
+      </w:pPr>
+      <w:r>
+        <w:t xml:space="preserve"> </w:t>
       </w:r>
     </w:p>
     <w:p>
@@ -2640,6 +2878,96 @@
     </w:lvl>
   </w:abstractNum>
   <w:abstractNum w:abstractNumId="2" w15:restartNumberingAfterBreak="0">
+    <w:nsid w:val="214D3C6F"/>
+    <w:multiLevelType w:val="hybridMultilevel"/>
+    <w:tmpl w:val="0A0A74FC"/>
+    <w:lvl w:ilvl="0" w:tplc="A4B8CAEA">
+      <w:start w:val="1"/>
+      <w:numFmt w:val="decimal"/>
+      <w:lvlText w:val="%1."/>
+      <w:lvlJc w:val="left"/>
+      <w:pPr>
+        <w:ind w:left="720" w:hanging="360"/>
+      </w:pPr>
+      <w:rPr>
+        <w:rFonts w:hint="default"/>
+        <w:b/>
+      </w:rPr>
+    </w:lvl>
+    <w:lvl w:ilvl="1" w:tplc="04090019" w:tentative="1">
+      <w:start w:val="1"/>
+      <w:numFmt w:val="lowerLetter"/>
+      <w:lvlText w:val="%2."/>
+      <w:lvlJc w:val="left"/>
+      <w:pPr>
+        <w:ind w:left="1440" w:hanging="360"/>
+      </w:pPr>
+    </w:lvl>
+    <w:lvl w:ilvl="2" w:tplc="0409001B" w:tentative="1">
+      <w:start w:val="1"/>
+      <w:numFmt w:val="lowerRoman"/>
+      <w:lvlText w:val="%3."/>
+      <w:lvlJc w:val="right"/>
+      <w:pPr>
+        <w:ind w:left="2160" w:hanging="180"/>
+      </w:pPr>
+    </w:lvl>
+    <w:lvl w:ilvl="3" w:tplc="0409000F" w:tentative="1">
+      <w:start w:val="1"/>
+      <w:numFmt w:val="decimal"/>
+      <w:lvlText w:val="%4."/>
+      <w:lvlJc w:val="left"/>
+      <w:pPr>
+        <w:ind w:left="2880" w:hanging="360"/>
+      </w:pPr>
+    </w:lvl>
+    <w:lvl w:ilvl="4" w:tplc="04090019" w:tentative="1">
+      <w:start w:val="1"/>
+      <w:numFmt w:val="lowerLetter"/>
+      <w:lvlText w:val="%5."/>
+      <w:lvlJc w:val="left"/>
+      <w:pPr>
+        <w:ind w:left="3600" w:hanging="360"/>
+      </w:pPr>
+    </w:lvl>
+    <w:lvl w:ilvl="5" w:tplc="0409001B" w:tentative="1">
+      <w:start w:val="1"/>
+      <w:numFmt w:val="lowerRoman"/>
+      <w:lvlText w:val="%6."/>
+      <w:lvlJc w:val="right"/>
+      <w:pPr>
+        <w:ind w:left="4320" w:hanging="180"/>
+      </w:pPr>
+    </w:lvl>
+    <w:lvl w:ilvl="6" w:tplc="0409000F" w:tentative="1">
+      <w:start w:val="1"/>
+      <w:numFmt w:val="decimal"/>
+      <w:lvlText w:val="%7."/>
+      <w:lvlJc w:val="left"/>
+      <w:pPr>
+        <w:ind w:left="5040" w:hanging="360"/>
+      </w:pPr>
+    </w:lvl>
+    <w:lvl w:ilvl="7" w:tplc="04090019" w:tentative="1">
+      <w:start w:val="1"/>
+      <w:numFmt w:val="lowerLetter"/>
+      <w:lvlText w:val="%8."/>
+      <w:lvlJc w:val="left"/>
+      <w:pPr>
+        <w:ind w:left="5760" w:hanging="360"/>
+      </w:pPr>
+    </w:lvl>
+    <w:lvl w:ilvl="8" w:tplc="0409001B" w:tentative="1">
+      <w:start w:val="1"/>
+      <w:numFmt w:val="lowerRoman"/>
+      <w:lvlText w:val="%9."/>
+      <w:lvlJc w:val="right"/>
+      <w:pPr>
+        <w:ind w:left="6480" w:hanging="180"/>
+      </w:pPr>
+    </w:lvl>
+  </w:abstractNum>
+  <w:abstractNum w:abstractNumId="3" w15:restartNumberingAfterBreak="0">
     <w:nsid w:val="26012F10"/>
     <w:multiLevelType w:val="hybridMultilevel"/>
     <w:tmpl w:val="CA98A94A"/>
@@ -2729,7 +3057,7 @@
       </w:pPr>
     </w:lvl>
   </w:abstractNum>
-  <w:abstractNum w:abstractNumId="3" w15:restartNumberingAfterBreak="0">
+  <w:abstractNum w:abstractNumId="4" w15:restartNumberingAfterBreak="0">
     <w:nsid w:val="2EF36D2D"/>
     <w:multiLevelType w:val="hybridMultilevel"/>
     <w:tmpl w:val="CC5A48BC"/>
@@ -2819,7 +3147,7 @@
       </w:pPr>
     </w:lvl>
   </w:abstractNum>
-  <w:abstractNum w:abstractNumId="4" w15:restartNumberingAfterBreak="0">
+  <w:abstractNum w:abstractNumId="5" w15:restartNumberingAfterBreak="0">
     <w:nsid w:val="334E6D8F"/>
     <w:multiLevelType w:val="hybridMultilevel"/>
     <w:tmpl w:val="150CCB4E"/>
@@ -2909,7 +3237,97 @@
       </w:pPr>
     </w:lvl>
   </w:abstractNum>
-  <w:abstractNum w:abstractNumId="5" w15:restartNumberingAfterBreak="0">
+  <w:abstractNum w:abstractNumId="6" w15:restartNumberingAfterBreak="0">
+    <w:nsid w:val="6D4966EB"/>
+    <w:multiLevelType w:val="hybridMultilevel"/>
+    <w:tmpl w:val="0A0A74FC"/>
+    <w:lvl w:ilvl="0" w:tplc="A4B8CAEA">
+      <w:start w:val="1"/>
+      <w:numFmt w:val="decimal"/>
+      <w:lvlText w:val="%1."/>
+      <w:lvlJc w:val="left"/>
+      <w:pPr>
+        <w:ind w:left="720" w:hanging="360"/>
+      </w:pPr>
+      <w:rPr>
+        <w:rFonts w:hint="default"/>
+        <w:b/>
+      </w:rPr>
+    </w:lvl>
+    <w:lvl w:ilvl="1" w:tplc="04090019" w:tentative="1">
+      <w:start w:val="1"/>
+      <w:numFmt w:val="lowerLetter"/>
+      <w:lvlText w:val="%2."/>
+      <w:lvlJc w:val="left"/>
+      <w:pPr>
+        <w:ind w:left="1440" w:hanging="360"/>
+      </w:pPr>
+    </w:lvl>
+    <w:lvl w:ilvl="2" w:tplc="0409001B" w:tentative="1">
+      <w:start w:val="1"/>
+      <w:numFmt w:val="lowerRoman"/>
+      <w:lvlText w:val="%3."/>
+      <w:lvlJc w:val="right"/>
+      <w:pPr>
+        <w:ind w:left="2160" w:hanging="180"/>
+      </w:pPr>
+    </w:lvl>
+    <w:lvl w:ilvl="3" w:tplc="0409000F" w:tentative="1">
+      <w:start w:val="1"/>
+      <w:numFmt w:val="decimal"/>
+      <w:lvlText w:val="%4."/>
+      <w:lvlJc w:val="left"/>
+      <w:pPr>
+        <w:ind w:left="2880" w:hanging="360"/>
+      </w:pPr>
+    </w:lvl>
+    <w:lvl w:ilvl="4" w:tplc="04090019" w:tentative="1">
+      <w:start w:val="1"/>
+      <w:numFmt w:val="lowerLetter"/>
+      <w:lvlText w:val="%5."/>
+      <w:lvlJc w:val="left"/>
+      <w:pPr>
+        <w:ind w:left="3600" w:hanging="360"/>
+      </w:pPr>
+    </w:lvl>
+    <w:lvl w:ilvl="5" w:tplc="0409001B" w:tentative="1">
+      <w:start w:val="1"/>
+      <w:numFmt w:val="lowerRoman"/>
+      <w:lvlText w:val="%6."/>
+      <w:lvlJc w:val="right"/>
+      <w:pPr>
+        <w:ind w:left="4320" w:hanging="180"/>
+      </w:pPr>
+    </w:lvl>
+    <w:lvl w:ilvl="6" w:tplc="0409000F" w:tentative="1">
+      <w:start w:val="1"/>
+      <w:numFmt w:val="decimal"/>
+      <w:lvlText w:val="%7."/>
+      <w:lvlJc w:val="left"/>
+      <w:pPr>
+        <w:ind w:left="5040" w:hanging="360"/>
+      </w:pPr>
+    </w:lvl>
+    <w:lvl w:ilvl="7" w:tplc="04090019" w:tentative="1">
+      <w:start w:val="1"/>
+      <w:numFmt w:val="lowerLetter"/>
+      <w:lvlText w:val="%8."/>
+      <w:lvlJc w:val="left"/>
+      <w:pPr>
+        <w:ind w:left="5760" w:hanging="360"/>
+      </w:pPr>
+    </w:lvl>
+    <w:lvl w:ilvl="8" w:tplc="0409001B" w:tentative="1">
+      <w:start w:val="1"/>
+      <w:numFmt w:val="lowerRoman"/>
+      <w:lvlText w:val="%9."/>
+      <w:lvlJc w:val="right"/>
+      <w:pPr>
+        <w:ind w:left="6480" w:hanging="180"/>
+      </w:pPr>
+    </w:lvl>
+  </w:abstractNum>
+  <w:abstractNum w:abstractNumId="7" w15:restartNumberingAfterBreak="0">
     <w:nsid w:val="78B04BD4"/>
     <w:multiLevelType w:val="hybridMultilevel"/>
     <w:tmpl w:val="A9E08698"/>
@@ -2998,23 +3416,122 @@
       </w:pPr>
     </w:lvl>
   </w:abstractNum>
+  <w:abstractNum w:abstractNumId="8" w15:restartNumberingAfterBreak="0">
+    <w:nsid w:val="7F9A014C"/>
+    <w:multiLevelType w:val="hybridMultilevel"/>
+    <w:tmpl w:val="0A0A74FC"/>
+    <w:lvl w:ilvl="0" w:tplc="A4B8CAEA">
+      <w:start w:val="1"/>
+      <w:numFmt w:val="decimal"/>
+      <w:lvlText w:val="%1."/>
+      <w:lvlJc w:val="left"/>
+      <w:pPr>
+        <w:ind w:left="720" w:hanging="360"/>
+      </w:pPr>
+      <w:rPr>
+        <w:rFonts w:hint="default"/>
+        <w:b/>
+      </w:rPr>
+    </w:lvl>
+    <w:lvl w:ilvl="1" w:tplc="04090019" w:tentative="1">
+      <w:start w:val="1"/>
+      <w:numFmt w:val="lowerLetter"/>
+      <w:lvlText w:val="%2."/>
+      <w:lvlJc w:val="left"/>
+      <w:pPr>
+        <w:ind w:left="1440" w:hanging="360"/>
+      </w:pPr>
+    </w:lvl>
+    <w:lvl w:ilvl="2" w:tplc="0409001B" w:tentative="1">
+      <w:start w:val="1"/>
+      <w:numFmt w:val="lowerRoman"/>
+      <w:lvlText w:val="%3."/>
+      <w:lvlJc w:val="right"/>
+      <w:pPr>
+        <w:ind w:left="2160" w:hanging="180"/>
+      </w:pPr>
+    </w:lvl>
+    <w:lvl w:ilvl="3" w:tplc="0409000F" w:tentative="1">
+      <w:start w:val="1"/>
+      <w:numFmt w:val="decimal"/>
+      <w:lvlText w:val="%4."/>
+      <w:lvlJc w:val="left"/>
+      <w:pPr>
+        <w:ind w:left="2880" w:hanging="360"/>
+      </w:pPr>
+    </w:lvl>
+    <w:lvl w:ilvl="4" w:tplc="04090019" w:tentative="1">
+      <w:start w:val="1"/>
+      <w:numFmt w:val="lowerLetter"/>
+      <w:lvlText w:val="%5."/>
+      <w:lvlJc w:val="left"/>
+      <w:pPr>
+        <w:ind w:left="3600" w:hanging="360"/>
+      </w:pPr>
+    </w:lvl>
+    <w:lvl w:ilvl="5" w:tplc="0409001B" w:tentative="1">
+      <w:start w:val="1"/>
+      <w:numFmt w:val="lowerRoman"/>
+      <w:lvlText w:val="%6."/>
+      <w:lvlJc w:val="right"/>
+      <w:pPr>
+        <w:ind w:left="4320" w:hanging="180"/>
+      </w:pPr>
+    </w:lvl>
+    <w:lvl w:ilvl="6" w:tplc="0409000F" w:tentative="1">
+      <w:start w:val="1"/>
+      <w:numFmt w:val="decimal"/>
+      <w:lvlText w:val="%7."/>
+      <w:lvlJc w:val="left"/>
+      <w:pPr>
+        <w:ind w:left="5040" w:hanging="360"/>
+      </w:pPr>
+    </w:lvl>
+    <w:lvl w:ilvl="7" w:tplc="04090019" w:tentative="1">
+      <w:start w:val="1"/>
+      <w:numFmt w:val="lowerLetter"/>
+      <w:lvlText w:val="%8."/>
+      <w:lvlJc w:val="left"/>
+      <w:pPr>
+        <w:ind w:left="5760" w:hanging="360"/>
+      </w:pPr>
+    </w:lvl>
+    <w:lvl w:ilvl="8" w:tplc="0409001B" w:tentative="1">
+      <w:start w:val="1"/>
+      <w:numFmt w:val="lowerRoman"/>
+      <w:lvlText w:val="%9."/>
+      <w:lvlJc w:val="right"/>
+      <w:pPr>
+        <w:ind w:left="6480" w:hanging="180"/>
+      </w:pPr>
+    </w:lvl>
+  </w:abstractNum>
   <w:num w:numId="1">
-    <w:abstractNumId w:val="3"/>
+    <w:abstractNumId w:val="4"/>
   </w:num>
   <w:num w:numId="2">
     <w:abstractNumId w:val="1"/>
   </w:num>
   <w:num w:numId="3">
-    <w:abstractNumId w:val="2"/>
+    <w:abstractNumId w:val="3"/>
   </w:num>
   <w:num w:numId="4">
-    <w:abstractNumId w:val="4"/>
+    <w:abstractNumId w:val="5"/>
   </w:num>
   <w:num w:numId="5">
     <w:abstractNumId w:val="0"/>
   </w:num>
   <w:num w:numId="6">
-    <w:abstractNumId w:val="5"/>
+    <w:abstractNumId w:val="7"/>
+  </w:num>
+  <w:num w:numId="7">
+    <w:abstractNumId w:val="8"/>
+  </w:num>
+  <w:num w:numId="8">
+    <w:abstractNumId w:val="2"/>
+  </w:num>
+  <w:num w:numId="9">
+    <w:abstractNumId w:val="6"/>
   </w:num>
 </w:numbering>
 </file>

</xml_diff>

<commit_message>
added sanity check to confirm ttl times
</commit_message>
<xml_diff>
--- a/Neuropixels Data Processing Pipeline.docx
+++ b/Neuropixels Data Processing Pipeline.docx
@@ -2554,17 +2554,27 @@
       </w:r>
       <w:proofErr w:type="spellEnd"/>
       <w:r>
-        <w:t xml:space="preserve"> really correspond to stimuli onsets, </w:t>
+        <w:t xml:space="preserve"> really correspond to stimuli onsets, run </w:t>
+      </w:r>
+      <w:proofErr w:type="spellStart"/>
+      <w:r>
+        <w:rPr>
+          <w:b/>
+          <w:i/>
+        </w:rPr>
+        <w:t>ttl_sanity_</w:t>
       </w:r>
       <w:proofErr w:type="gramStart"/>
       <w:r>
-        <w:t>run ?</w:t>
-      </w:r>
+        <w:rPr>
+          <w:b/>
+          <w:i/>
+        </w:rPr>
+        <w:t>check.ipynb</w:t>
+      </w:r>
+      <w:proofErr w:type="spellEnd"/>
       <w:proofErr w:type="gramEnd"/>
       <w:r>
-        <w:t>??</w:t>
-      </w:r>
-      <w:r>
         <w:rPr>
           <w:b/>
           <w:i/>
@@ -2583,28 +2593,18 @@
         <w:t xml:space="preserve"> events</w:t>
       </w:r>
       <w:r>
-        <w:t xml:space="preserve"> plus the corresponding time</w:t>
-      </w:r>
-      <w:r>
-        <w:t xml:space="preserve"> in a spectrogram/waveform.</w:t>
+        <w:t xml:space="preserve"> plus </w:t>
+      </w:r>
+      <w:r>
+        <w:t xml:space="preserve">a selected </w:t>
+      </w:r>
+      <w:r>
+        <w:t>Neuropixels channel</w:t>
       </w:r>
       <w:bookmarkStart w:id="0" w:name="_GoBack"/>
       <w:bookmarkEnd w:id="0"/>
-    </w:p>
-    <w:p>
-      <w:pPr>
-        <w:tabs>
-          <w:tab w:val="left" w:pos="2581"/>
-        </w:tabs>
-        <w:jc w:val="both"/>
-      </w:pPr>
-    </w:p>
-    <w:p>
-      <w:pPr>
-        <w:jc w:val="both"/>
-      </w:pPr>
-      <w:r>
-        <w:t xml:space="preserve"> </w:t>
+      <w:r>
+        <w:t>.</w:t>
       </w:r>
     </w:p>
     <w:p>

</xml_diff>